<commit_message>
feat: make the value clear - sample minuta, import summary, reopen, repeated fields
- Landing: built-in sample minuta, "why not Word" section, reopen a saved
  .docx + .json
- Import review: found/fields/repeats/validated summary, type explanations,
  limits note
- Form: "Preenche N sítios" for fields used several times
- Templates: summary block + declaration/identification clauses that reuse
  existing fields (one input fills 3-6 places); signature blocks with names
- Importer: ignore signature lines, nearest-role and payee detection,
  generic parties; round-trip eval 526/526

Co-Authored-By: Claude Sonnet 5.5 <noreply@anthropic.com>
</commit_message>
<xml_diff>
--- a/templates/arrendamento/template.docx
+++ b/templates/arrendamento/template.docx
@@ -18,6 +18,57 @@
       </w:r>
     </w:p>
     <w:p>
+      <w:pPr>
+        <w:jc w:val="both"/>
+      </w:pPr>
+      <w:r>
+        <w:rPr>
+          <w:b/>
+        </w:rPr>
+        <w:t xml:space="preserve">QUADRO-RESUMO</w:t>
+      </w:r>
+    </w:p>
+    <w:p>
+      <w:pPr>
+        <w:jc w:val="both"/>
+      </w:pPr>
+      <w:r>
+        <w:t xml:space="preserve">Senhorio: {{senhorio_nome}}, NIF {{senhorio_nif:nif}}.</w:t>
+      </w:r>
+    </w:p>
+    <w:p>
+      <w:pPr>
+        <w:jc w:val="both"/>
+      </w:pPr>
+      <w:r>
+        <w:t xml:space="preserve">Arrendatário: {{arrendatario_nome}}, NIF {{arrendatario_nif:nif}}.</w:t>
+      </w:r>
+    </w:p>
+    <w:p>
+      <w:pPr>
+        <w:jc w:val="both"/>
+      </w:pPr>
+      <w:r>
+        <w:t xml:space="preserve">Locado: {{imovel_tipologia}}, fração {{imovel_fracao}}, {{imovel_morada}}, freguesia de {{imovel_freguesia}}, concelho de {{imovel_concelho}}.</w:t>
+      </w:r>
+    </w:p>
+    <w:p>
+      <w:pPr>
+        <w:jc w:val="both"/>
+      </w:pPr>
+      <w:r>
+        <w:t xml:space="preserve">Prazo: {{prazo_meses:int}} ({{prazo_meses:int|extenso}}) meses, com início em {{data_inicio:data}}.</w:t>
+      </w:r>
+    </w:p>
+    <w:p>
+      <w:pPr>
+        <w:jc w:val="both"/>
+      </w:pPr>
+      <w:r>
+        <w:t xml:space="preserve">Renda mensal: {{renda_valor:eur}} ({{renda_valor:eur|extenso}}), paga até ao dia {{renda_dia_pagamento:int}} de cada mês.</w:t>
+      </w:r>
+    </w:p>
+    <w:p>
       <w:r>
         <w:rPr>
           <w:b/>
@@ -768,6 +819,118 @@
         <w:rPr>
           <w:b/>
         </w:rPr>
+        <w:t xml:space="preserve">(Declarações das Partes)</w:t>
+      </w:r>
+    </w:p>
+    <w:p>
+      <w:pPr>
+        <w:jc w:val="both"/>
+      </w:pPr>
+      <w:r>
+        <w:rPr>
+          <w:b/>
+        </w:rPr>
+        <w:t xml:space="preserve">{{pt}}. </w:t>
+      </w:r>
+      <w:r>
+        <w:t xml:space="preserve">O Senhorio, {{senhorio_nome}}, contribuinte fiscal n.º {{senhorio_nif:nif}}, declara que dá de arrendamento ao Arrendatário o locado identificado na {{ref:cl_locado}}, sito em {{imovel_morada}}, e que tem legitimidade para o fazer.</w:t>
+      </w:r>
+    </w:p>
+    <w:p>
+      <w:pPr>
+        <w:jc w:val="both"/>
+      </w:pPr>
+      <w:r>
+        <w:rPr>
+          <w:b/>
+        </w:rPr>
+        <w:t xml:space="preserve">{{pt}}. </w:t>
+      </w:r>
+      <w:r>
+        <w:t xml:space="preserve">O Arrendatário, {{arrendatario_nome}}, contribuinte fiscal n.º {{arrendatario_nif:nif}}, declara que visitou o locado, sito em {{imovel_morada}}, que o aceita no estado em que se encontra e que o destina a sua habitação permanente.</w:t>
+      </w:r>
+    </w:p>
+    <w:p>
+      <w:pPr>
+        <w:jc w:val="center"/>
+        <w:rPr>
+          <w:b/>
+        </w:rPr>
+      </w:pPr>
+      <w:r>
+        <w:rPr>
+          <w:b/>
+        </w:rPr>
+        <w:t xml:space="preserve">CLÁUSULA {{cl}}</w:t>
+      </w:r>
+    </w:p>
+    <w:p>
+      <w:pPr>
+        <w:jc w:val="center"/>
+        <w:rPr>
+          <w:b/>
+        </w:rPr>
+      </w:pPr>
+      <w:r>
+        <w:rPr>
+          <w:b/>
+        </w:rPr>
+        <w:t xml:space="preserve">(Pagamento da renda)</w:t>
+      </w:r>
+    </w:p>
+    <w:p>
+      <w:pPr>
+        <w:jc w:val="both"/>
+      </w:pPr>
+      <w:r>
+        <w:rPr>
+          <w:b/>
+        </w:rPr>
+        <w:t xml:space="preserve">{{pt}}. </w:t>
+      </w:r>
+      <w:r>
+        <w:t xml:space="preserve">A renda mensal de {{renda_valor:eur}} ({{renda_valor:eur|extenso}}) é paga pelo Arrendatário, {{arrendatario_nome}}, ao Senhorio, {{senhorio_nome}}, por transferência bancária para o IBAN {{senhorio_iban:iban}}, junto do {{senhorio_banco}}, até ao dia {{renda_dia_pagamento:int}} de cada mês.</w:t>
+      </w:r>
+    </w:p>
+    <w:p>
+      <w:pPr>
+        <w:jc w:val="both"/>
+      </w:pPr>
+      <w:r>
+        <w:rPr>
+          <w:b/>
+        </w:rPr>
+        <w:t xml:space="preserve">{{pt}}. </w:t>
+      </w:r>
+      <w:r>
+        <w:t xml:space="preserve">O comprovativo da transferência vale como recibo de quitação da renda relativa ao mês a que respeite.</w:t>
+      </w:r>
+    </w:p>
+    <w:p>
+      <w:pPr>
+        <w:jc w:val="center"/>
+        <w:rPr>
+          <w:b/>
+        </w:rPr>
+      </w:pPr>
+      <w:r>
+        <w:rPr>
+          <w:b/>
+        </w:rPr>
+        <w:t xml:space="preserve">CLÁUSULA {{cl}}</w:t>
+      </w:r>
+    </w:p>
+    <w:p>
+      <w:pPr>
+        <w:jc w:val="center"/>
+        <w:rPr>
+          <w:b/>
+        </w:rPr>
+      </w:pPr>
+      <w:r>
+        <w:rPr>
+          <w:b/>
+        </w:rPr>
         <w:t xml:space="preserve">(Comunicações e domicílio convencionado)</w:t>
       </w:r>
     </w:p>
@@ -891,12 +1054,28 @@
         <w:jc w:val="both"/>
       </w:pPr>
       <w:r>
+        <w:t xml:space="preserve">{{senhorio_nome}}</w:t>
+      </w:r>
+    </w:p>
+    <w:p>
+      <w:pPr>
+        <w:jc w:val="both"/>
+      </w:pPr>
+      <w:r>
         <w:t xml:space="preserve">O Arrendatário</w:t>
       </w:r>
     </w:p>
     <w:p>
       <w:r>
         <w:t xml:space="preserve">____________________________________________</w:t>
+      </w:r>
+    </w:p>
+    <w:p>
+      <w:pPr>
+        <w:jc w:val="both"/>
+      </w:pPr>
+      <w:r>
+        <w:t xml:space="preserve">{{arrendatario_nome}}</w:t>
       </w:r>
     </w:p>
     <w:sectPr>

</xml_diff>